<commit_message>
Add 2 main project
</commit_message>
<xml_diff>
--- a/06-Pandas/Notes.docx
+++ b/06-Pandas/Notes.docx
@@ -11,6 +11,250 @@
           <w:rFonts w:asciiTheme="majorBidi" w:hAnsiTheme="majorBidi"/>
           <w:sz w:val="24"/>
           <w:szCs w:val="24"/>
+          <w:rtl/>
+        </w:rPr>
+      </w:pPr>
+    </w:p>
+    <w:p>
+      <w:pPr>
+        <w:bidi w:val="0"/>
+        <w:spacing w:after="0"/>
+        <w:jc w:val="left"/>
+        <w:rPr>
+          <w:rFonts w:asciiTheme="majorBidi" w:hAnsiTheme="majorBidi"/>
+          <w:sz w:val="24"/>
+          <w:szCs w:val="24"/>
+        </w:rPr>
+      </w:pPr>
+      <w:r>
+        <w:rPr>
+          <w:rFonts w:asciiTheme="majorBidi" w:hAnsiTheme="majorBidi"/>
+          <w:sz w:val="24"/>
+          <w:szCs w:val="24"/>
+        </w:rPr>
+        <w:t>#This allows you to see all the columns, not just like 15</w:t>
+      </w:r>
+    </w:p>
+    <w:p>
+      <w:pPr>
+        <w:bidi w:val="0"/>
+        <w:spacing w:after="0"/>
+        <w:jc w:val="left"/>
+        <w:rPr>
+          <w:rFonts w:asciiTheme="majorBidi" w:hAnsiTheme="majorBidi"/>
+          <w:sz w:val="24"/>
+          <w:szCs w:val="24"/>
+        </w:rPr>
+      </w:pPr>
+      <w:r>
+        <w:rPr>
+          <w:rFonts w:asciiTheme="majorBidi" w:hAnsiTheme="majorBidi"/>
+          <w:sz w:val="24"/>
+          <w:szCs w:val="24"/>
+        </w:rPr>
+        <w:t>pd.set_option('display.</w:t>
+      </w:r>
+      <w:r>
+        <w:rPr>
+          <w:rFonts w:asciiTheme="majorBidi" w:hAnsiTheme="majorBidi"/>
+          <w:color w:val="FF0000"/>
+          <w:sz w:val="24"/>
+          <w:szCs w:val="24"/>
+        </w:rPr>
+        <w:t>max_columns'</w:t>
+      </w:r>
+      <w:r>
+        <w:rPr>
+          <w:rFonts w:asciiTheme="majorBidi" w:hAnsiTheme="majorBidi"/>
+          <w:sz w:val="24"/>
+          <w:szCs w:val="24"/>
+        </w:rPr>
+        <w:t>, None)</w:t>
+      </w:r>
+    </w:p>
+    <w:p>
+      <w:pPr>
+        <w:bidi w:val="0"/>
+        <w:spacing w:after="0"/>
+        <w:jc w:val="left"/>
+        <w:rPr>
+          <w:rFonts w:asciiTheme="majorBidi" w:hAnsiTheme="majorBidi"/>
+          <w:sz w:val="24"/>
+          <w:szCs w:val="24"/>
+        </w:rPr>
+      </w:pPr>
+      <w:r>
+        <w:rPr>
+          <w:rFonts w:asciiTheme="majorBidi" w:hAnsiTheme="majorBidi"/>
+          <w:sz w:val="24"/>
+          <w:szCs w:val="24"/>
+        </w:rPr>
+        <w:t>pd.set_option('display.</w:t>
+      </w:r>
+      <w:r>
+        <w:rPr>
+          <w:rFonts w:asciiTheme="majorBidi" w:hAnsiTheme="majorBidi"/>
+          <w:color w:val="FF0000"/>
+          <w:sz w:val="24"/>
+          <w:szCs w:val="24"/>
+        </w:rPr>
+        <w:t>max_rows'</w:t>
+      </w:r>
+      <w:r>
+        <w:rPr>
+          <w:rFonts w:asciiTheme="majorBidi" w:hAnsiTheme="majorBidi"/>
+          <w:sz w:val="24"/>
+          <w:szCs w:val="24"/>
+        </w:rPr>
+        <w:t>, None)</w:t>
+      </w:r>
+    </w:p>
+    <w:p>
+      <w:pPr>
+        <w:bidi w:val="0"/>
+        <w:spacing w:after="0"/>
+        <w:jc w:val="left"/>
+        <w:rPr>
+          <w:rFonts w:asciiTheme="majorBidi" w:hAnsiTheme="majorBidi"/>
+          <w:sz w:val="24"/>
+          <w:szCs w:val="24"/>
+        </w:rPr>
+      </w:pPr>
+    </w:p>
+    <w:p>
+      <w:pPr>
+        <w:bidi w:val="0"/>
+        <w:spacing w:after="0"/>
+        <w:jc w:val="left"/>
+        <w:rPr>
+          <w:rFonts w:asciiTheme="majorBidi" w:hAnsiTheme="majorBidi"/>
+          <w:sz w:val="24"/>
+          <w:szCs w:val="24"/>
+          <w:rtl/>
+        </w:rPr>
+      </w:pPr>
+      <w:r>
+        <w:rPr>
+          <w:rFonts w:asciiTheme="majorBidi" w:hAnsiTheme="majorBidi"/>
+          <w:sz w:val="24"/>
+          <w:szCs w:val="24"/>
+        </w:rPr>
+        <w:t xml:space="preserve"># show number with 5 float </w:t>
+      </w:r>
+      <w:r>
+        <w:rPr>
+          <w:rFonts w:asciiTheme="majorBidi" w:hAnsiTheme="majorBidi"/>
+          <w:sz w:val="24"/>
+          <w:szCs w:val="24"/>
+        </w:rPr>
+        <w:t xml:space="preserve">, </w:t>
+      </w:r>
+      <w:r>
+        <w:rPr>
+          <w:rFonts w:asciiTheme="majorBidi" w:hAnsiTheme="majorBidi"/>
+          <w:sz w:val="24"/>
+          <w:szCs w:val="24"/>
+        </w:rPr>
+        <w:t>2.006419e+0</w:t>
+      </w:r>
+      <w:r>
+        <w:rPr>
+          <w:rFonts w:asciiTheme="majorBidi" w:hAnsiTheme="majorBidi"/>
+          <w:sz w:val="24"/>
+          <w:szCs w:val="24"/>
+        </w:rPr>
+        <w:t xml:space="preserve">7 like this : </w:t>
+      </w:r>
+      <w:r>
+        <w:rPr>
+          <w:rFonts w:asciiTheme="majorBidi" w:hAnsiTheme="majorBidi"/>
+          <w:sz w:val="24"/>
+          <w:szCs w:val="24"/>
+        </w:rPr>
+        <w:t>20064187.00000</w:t>
+      </w:r>
+      <w:r>
+        <w:rPr>
+          <w:rFonts w:asciiTheme="majorBidi" w:hAnsiTheme="majorBidi"/>
+          <w:sz w:val="24"/>
+          <w:szCs w:val="24"/>
+        </w:rPr>
+        <w:t>,</w:t>
+      </w:r>
+      <w:r>
+        <w:rPr>
+          <w:rFonts w:asciiTheme="majorBidi" w:hAnsiTheme="majorBidi"/>
+          <w:sz w:val="24"/>
+          <w:szCs w:val="24"/>
+        </w:rPr>
+        <w:t xml:space="preserve"> </w:t>
+      </w:r>
+      <w:r>
+        <w:rPr>
+          <w:rFonts w:asciiTheme="majorBidi" w:hAnsiTheme="majorBidi"/>
+          <w:sz w:val="24"/>
+          <w:szCs w:val="24"/>
+        </w:rPr>
+        <w:t xml:space="preserve">for all data in </w:t>
+      </w:r>
+      <w:r>
+        <w:rPr>
+          <w:rFonts w:asciiTheme="majorBidi" w:hAnsiTheme="majorBidi"/>
+          <w:sz w:val="24"/>
+          <w:szCs w:val="24"/>
+        </w:rPr>
+        <w:t xml:space="preserve">all columns of </w:t>
+      </w:r>
+      <w:r>
+        <w:rPr>
+          <w:rFonts w:asciiTheme="majorBidi" w:hAnsiTheme="majorBidi"/>
+          <w:sz w:val="24"/>
+          <w:szCs w:val="24"/>
+        </w:rPr>
+        <w:t>datafram</w:t>
+      </w:r>
+    </w:p>
+    <w:p>
+      <w:pPr>
+        <w:bidi w:val="0"/>
+        <w:spacing w:after="0"/>
+        <w:jc w:val="left"/>
+        <w:rPr>
+          <w:rFonts w:asciiTheme="majorBidi" w:hAnsiTheme="majorBidi"/>
+          <w:sz w:val="24"/>
+          <w:szCs w:val="24"/>
+        </w:rPr>
+      </w:pPr>
+      <w:r>
+        <w:rPr>
+          <w:rFonts w:asciiTheme="majorBidi" w:hAnsiTheme="majorBidi"/>
+          <w:sz w:val="24"/>
+          <w:szCs w:val="24"/>
+        </w:rPr>
+        <w:t>pd.set_option('display.float_format', lambda x: '%.5f' % x)</w:t>
+      </w:r>
+    </w:p>
+    <w:p>
+      <w:pPr>
+        <w:bidi w:val="0"/>
+        <w:spacing w:after="0"/>
+        <w:jc w:val="left"/>
+        <w:rPr>
+          <w:rFonts w:asciiTheme="majorBidi" w:hAnsiTheme="majorBidi"/>
+          <w:sz w:val="24"/>
+          <w:szCs w:val="24"/>
+        </w:rPr>
+      </w:pPr>
+    </w:p>
+    <w:p>
+      <w:pPr>
+        <w:bidi w:val="0"/>
+        <w:spacing w:after="0"/>
+        <w:jc w:val="left"/>
+        <w:rPr>
+          <w:rFonts w:asciiTheme="majorBidi" w:hAnsiTheme="majorBidi"/>
+          <w:sz w:val="24"/>
+          <w:szCs w:val="24"/>
         </w:rPr>
       </w:pPr>
       <w:r>
@@ -1131,7 +1375,6 @@
           <w:sz w:val="24"/>
           <w:szCs w:val="24"/>
         </w:rPr>
-        <w:lastRenderedPageBreak/>
         <w:t>pd.</w:t>
       </w:r>
       <w:r>
@@ -2034,6 +2277,7 @@
           <w:sz w:val="24"/>
           <w:szCs w:val="24"/>
         </w:rPr>
+        <w:lastRenderedPageBreak/>
         <w:t>df.</w:t>
       </w:r>
       <w:r>
@@ -2315,7 +2559,6 @@
           <w:sz w:val="24"/>
           <w:szCs w:val="24"/>
         </w:rPr>
-        <w:lastRenderedPageBreak/>
         <w:t>df.</w:t>
       </w:r>
       <w:r>

</xml_diff>